<commit_message>
Clarify evaluator setup guide
</commit_message>
<xml_diff>
--- a/คู่มือการใช้งาน_Cooking_Start.docx
+++ b/คู่มือการใช้งาน_Cooking_Start.docx
@@ -187,6 +187,227 @@
                 <w:sz w:val="22"/>
               </w:rPr>
               <w:t>ระบบต้องเชื่อมต่อกับ Backend จึงจะสามารถล็อกอินและบันทึกข้อมูลสินค้าได้</w:t>
+            </w:r>
+          </w:p>
+        </w:tc>
+      </w:tr>
+    </w:tbl>
+    <w:p/>
+    <w:p>
+      <w:r>
+        <w:br w:type="page"/>
+      </w:r>
+    </w:p>
+    <w:p>
+      <w:pPr>
+        <w:pStyle w:val="Heading1"/>
+      </w:pPr>
+      <w:r>
+        <w:t>สำหรับผู้ตรวจ: วิธีเปิดระบบจาก GitHub</w:t>
+      </w:r>
+    </w:p>
+    <w:p>
+      <w:pPr/>
+      <w:r>
+        <w:rPr>
+          <w:rFonts w:ascii="Arial" w:hAnsi="Arial" w:eastAsia="Arial"/>
+          <w:sz w:val="22"/>
+        </w:rPr>
+        <w:t>ไม่ต้องใช้ Username หรือ Password ของผู้พัฒนา ผู้ตรวจสามารถตั้งบัญชีสำหรับทดลองเองได้ตามขั้นตอนนี้</w:t>
+      </w:r>
+    </w:p>
+    <w:p>
+      <w:pPr>
+        <w:pStyle w:val="ListNumber"/>
+      </w:pPr>
+      <w:r>
+        <w:rPr>
+          <w:rFonts w:ascii="Arial" w:hAnsi="Arial" w:eastAsia="Arial"/>
+          <w:sz w:val="22"/>
+        </w:rPr>
+        <w:t>ดาวน์โหลดหรือ clone โครงการจาก GitHub</w:t>
+      </w:r>
+    </w:p>
+    <w:p>
+      <w:pPr>
+        <w:pStyle w:val="ListNumber"/>
+      </w:pPr>
+      <w:r>
+        <w:rPr>
+          <w:rFonts w:ascii="Arial" w:hAnsi="Arial" w:eastAsia="Arial"/>
+          <w:sz w:val="22"/>
+        </w:rPr>
+        <w:t>เปิด phpMyAdmin แล้วสร้างฐานข้อมูลใหม่ เช่น cooking_start</w:t>
+      </w:r>
+    </w:p>
+    <w:p>
+      <w:pPr>
+        <w:pStyle w:val="ListNumber"/>
+      </w:pPr>
+      <w:r>
+        <w:rPr>
+          <w:rFonts w:ascii="Arial" w:hAnsi="Arial" w:eastAsia="Arial"/>
+          <w:sz w:val="22"/>
+        </w:rPr>
+        <w:t>เลือกฐานข้อมูลที่สร้าง แล้วกด Import เลือกไฟล์ ip_std6730202602.sql และกด Import เพื่อสร้างตาราง products และ users</w:t>
+      </w:r>
+    </w:p>
+    <w:p>
+      <w:pPr>
+        <w:pStyle w:val="ListNumber"/>
+      </w:pPr>
+      <w:r>
+        <w:rPr>
+          <w:rFonts w:ascii="Arial" w:hAnsi="Arial" w:eastAsia="Arial"/>
+          <w:sz w:val="22"/>
+        </w:rPr>
+        <w:t>เปิดโฟลเดอร์ backend คัดลอกไฟล์ .env.example แล้วเปลี่ยนชื่อไฟล์ที่คัดลอกเป็น .env</w:t>
+      </w:r>
+    </w:p>
+    <w:p>
+      <w:pPr>
+        <w:pStyle w:val="ListNumber"/>
+      </w:pPr>
+      <w:r>
+        <w:rPr>
+          <w:rFonts w:ascii="Arial" w:hAnsi="Arial" w:eastAsia="Arial"/>
+          <w:sz w:val="22"/>
+        </w:rPr>
+        <w:t>เปิด backend/.env แล้วแทนค่าตัวอย่าง DB_USER, DB_PASSWORD และ DB_NAME ด้วยข้อมูล MySQL ของเครื่องผู้ตรวจ</w:t>
+      </w:r>
+    </w:p>
+    <w:p>
+      <w:pPr>
+        <w:pStyle w:val="ListNumber"/>
+      </w:pPr>
+      <w:r>
+        <w:rPr>
+          <w:rFonts w:ascii="Arial" w:hAnsi="Arial" w:eastAsia="Arial"/>
+          <w:sz w:val="22"/>
+        </w:rPr>
+        <w:t>ใน backend/.env ตั้ง ADMIN_USERNAME และ ADMIN_PASSWORD ตามบัญชีที่ต้องการใช้ทดสอบ</w:t>
+      </w:r>
+    </w:p>
+    <w:p>
+      <w:pPr>
+        <w:pStyle w:val="ListNumber"/>
+      </w:pPr>
+      <w:r>
+        <w:rPr>
+          <w:rFonts w:ascii="Arial" w:hAnsi="Arial" w:eastAsia="Arial"/>
+          <w:sz w:val="22"/>
+        </w:rPr>
+        <w:t>เปิด Terminal ในโฟลเดอร์ backend แล้วรัน npm install และ npm start ระบบจะแสดงว่า API running on port 3056</w:t>
+      </w:r>
+    </w:p>
+    <w:p>
+      <w:pPr>
+        <w:pStyle w:val="ListNumber"/>
+      </w:pPr>
+      <w:r>
+        <w:rPr>
+          <w:rFonts w:ascii="Arial" w:hAnsi="Arial" w:eastAsia="Arial"/>
+          <w:sz w:val="22"/>
+        </w:rPr>
+        <w:t>ที่โฟลเดอร์หลักของโครงการ คัดลอก .env.example เป็น .env แล้วตั้ง EXPO_PUBLIC_API_BASE_URL=http://localhost:3056/api</w:t>
+      </w:r>
+    </w:p>
+    <w:p>
+      <w:pPr>
+        <w:pStyle w:val="ListNumber"/>
+      </w:pPr>
+      <w:r>
+        <w:rPr>
+          <w:rFonts w:ascii="Arial" w:hAnsi="Arial" w:eastAsia="Arial"/>
+          <w:sz w:val="22"/>
+        </w:rPr>
+        <w:t>เปิด Terminal ที่โฟลเดอร์หลัก รัน npm install แล้วรัน npx expo start</w:t>
+      </w:r>
+    </w:p>
+    <w:p>
+      <w:pPr>
+        <w:pStyle w:val="ListNumber"/>
+      </w:pPr>
+      <w:r>
+        <w:rPr>
+          <w:rFonts w:ascii="Arial" w:hAnsi="Arial" w:eastAsia="Arial"/>
+          <w:sz w:val="22"/>
+        </w:rPr>
+        <w:t>เปิดแอป แล้วล็อกอินด้วย ADMIN_USERNAME และ ADMIN_PASSWORD ที่ตั้งไว้ใน backend/.env</w:t>
+      </w:r>
+    </w:p>
+    <w:tbl>
+      <w:tblPr>
+        <w:tblW w:type="dxa" w:w="9360"/>
+        <w:jc w:val="left"/>
+        <w:tblLayout w:type="fixed"/>
+        <w:tblLook w:firstColumn="1" w:firstRow="1" w:lastColumn="0" w:lastRow="0" w:noHBand="0" w:noVBand="1" w:val="04A0"/>
+      </w:tblPr>
+      <w:tblGrid>
+        <w:gridCol w:w="9360"/>
+      </w:tblGrid>
+      <w:tr>
+        <w:tc>
+          <w:tcPr>
+            <w:tcW w:type="dxa" w:w="9360"/>
+            <w:vAlign w:val="center"/>
+            <w:shd w:fill="F4F6F9"/>
+          </w:tcPr>
+          <w:p>
+            <w:r>
+              <w:rPr>
+                <w:rFonts w:ascii="Arial" w:hAnsi="Arial" w:eastAsia="Arial"/>
+                <w:b/>
+                <w:color w:val="1F4D78"/>
+                <w:sz w:val="22"/>
+              </w:rPr>
+              <w:t xml:space="preserve">ตัวอย่าง backend/.env: </w:t>
+            </w:r>
+            <w:r>
+              <w:rPr>
+                <w:rFonts w:ascii="Arial" w:hAnsi="Arial" w:eastAsia="Arial"/>
+                <w:sz w:val="22"/>
+              </w:rPr>
+              <w:t>DB_NAME=cooking_start, ADMIN_USERNAME=teacher และ ADMIN_PASSWORD=1234 (ให้เปลี่ยน DB_USER และ DB_PASSWORD ตาม MySQL ของเครื่องที่ใช้)</w:t>
+            </w:r>
+          </w:p>
+        </w:tc>
+      </w:tr>
+    </w:tbl>
+    <w:p/>
+    <w:tbl>
+      <w:tblPr>
+        <w:tblW w:type="dxa" w:w="9360"/>
+        <w:jc w:val="left"/>
+        <w:tblLayout w:type="fixed"/>
+        <w:tblLook w:firstColumn="1" w:firstRow="1" w:lastColumn="0" w:lastRow="0" w:noHBand="0" w:noVBand="1" w:val="04A0"/>
+      </w:tblPr>
+      <w:tblGrid>
+        <w:gridCol w:w="9360"/>
+      </w:tblGrid>
+      <w:tr>
+        <w:tc>
+          <w:tcPr>
+            <w:tcW w:type="dxa" w:w="9360"/>
+            <w:vAlign w:val="center"/>
+            <w:shd w:fill="F4F6F9"/>
+          </w:tcPr>
+          <w:p>
+            <w:r>
+              <w:rPr>
+                <w:rFonts w:ascii="Arial" w:hAnsi="Arial" w:eastAsia="Arial"/>
+                <w:b/>
+                <w:color w:val="1F4D78"/>
+                <w:sz w:val="22"/>
+              </w:rPr>
+              <w:t xml:space="preserve">สำคัญ: </w:t>
+            </w:r>
+            <w:r>
+              <w:rPr>
+                <w:rFonts w:ascii="Arial" w:hAnsi="Arial" w:eastAsia="Arial"/>
+                <w:sz w:val="22"/>
+              </w:rPr>
+              <w:t>ชื่อไฟล์ต้องเป็น .env จริง ๆ ไม่ใช่ .env.txt และไม่ต้องนำไฟล์ .env ขึ้น GitHub</w:t>
             </w:r>
           </w:p>
         </w:tc>

</xml_diff>

<commit_message>
Use formal language in setup guide
</commit_message>
<xml_diff>
--- a/คู่มือการใช้งาน_Cooking_Start.docx
+++ b/คู่มือการใช้งาน_Cooking_Start.docx
@@ -203,7 +203,7 @@
         <w:pStyle w:val="Heading1"/>
       </w:pPr>
       <w:r>
-        <w:t>สำหรับผู้ตรวจ: วิธีเปิดระบบจาก GitHub</w:t>
+        <w:t>แนวทางการติดตั้งระบบจาก GitHub</w:t>
       </w:r>
     </w:p>
     <w:p>
@@ -213,7 +213,7 @@
           <w:rFonts w:ascii="Arial" w:hAnsi="Arial" w:eastAsia="Arial"/>
           <w:sz w:val="22"/>
         </w:rPr>
-        <w:t>ไม่ต้องใช้ Username หรือ Password ของผู้พัฒนา ผู้ตรวจสามารถตั้งบัญชีสำหรับทดลองเองได้ตามขั้นตอนนี้</w:t>
+        <w:t>ระบบรองรับการกำหนดบัญชีผู้ดูแลระบบใหม่ผ่านไฟล์การตั้งค่า โดยไม่ต้องใช้ข้อมูลบัญชีของผู้พัฒนา</w:t>
       </w:r>
     </w:p>
     <w:p>
@@ -273,7 +273,7 @@
           <w:rFonts w:ascii="Arial" w:hAnsi="Arial" w:eastAsia="Arial"/>
           <w:sz w:val="22"/>
         </w:rPr>
-        <w:t>เปิด backend/.env แล้วแทนค่าตัวอย่าง DB_USER, DB_PASSWORD และ DB_NAME ด้วยข้อมูล MySQL ของเครื่องผู้ตรวจ</w:t>
+        <w:t>กำหนดค่า DB_USER, DB_PASSWORD และ DB_NAME ใน backend/.env ให้ตรงกับ MySQL ของเครื่องที่ใช้งาน</w:t>
       </w:r>
     </w:p>
     <w:p>
@@ -285,7 +285,7 @@
           <w:rFonts w:ascii="Arial" w:hAnsi="Arial" w:eastAsia="Arial"/>
           <w:sz w:val="22"/>
         </w:rPr>
-        <w:t>ใน backend/.env ตั้ง ADMIN_USERNAME และ ADMIN_PASSWORD ตามบัญชีที่ต้องการใช้ทดสอบ</w:t>
+        <w:t>กำหนด ADMIN_USERNAME และ ADMIN_PASSWORD ใน backend/.env สำหรับบัญชีผู้ดูแลระบบ</w:t>
       </w:r>
     </w:p>
     <w:p>
@@ -361,14 +361,14 @@
                 <w:color w:val="1F4D78"/>
                 <w:sz w:val="22"/>
               </w:rPr>
-              <w:t xml:space="preserve">ตัวอย่าง backend/.env: </w:t>
+              <w:t xml:space="preserve">ตัวอย่างค่า backend/.env: </w:t>
             </w:r>
             <w:r>
               <w:rPr>
                 <w:rFonts w:ascii="Arial" w:hAnsi="Arial" w:eastAsia="Arial"/>
                 <w:sz w:val="22"/>
               </w:rPr>
-              <w:t>DB_NAME=cooking_start, ADMIN_USERNAME=teacher และ ADMIN_PASSWORD=1234 (ให้เปลี่ยน DB_USER และ DB_PASSWORD ตาม MySQL ของเครื่องที่ใช้)</w:t>
+              <w:t>DB_NAME=cooking_start, ADMIN_USERNAME=teacher และ ADMIN_PASSWORD=1234 โดย DB_USER และ DB_PASSWORD ต้องกำหนดตาม MySQL ของเครื่องที่ใช้งาน</w:t>
             </w:r>
           </w:p>
         </w:tc>
@@ -400,14 +400,14 @@
                 <w:color w:val="1F4D78"/>
                 <w:sz w:val="22"/>
               </w:rPr>
-              <w:t xml:space="preserve">สำคัญ: </w:t>
+              <w:t xml:space="preserve">ข้อกำหนด: </w:t>
             </w:r>
             <w:r>
               <w:rPr>
                 <w:rFonts w:ascii="Arial" w:hAnsi="Arial" w:eastAsia="Arial"/>
                 <w:sz w:val="22"/>
               </w:rPr>
-              <w:t>ชื่อไฟล์ต้องเป็น .env จริง ๆ ไม่ใช่ .env.txt และไม่ต้องนำไฟล์ .env ขึ้น GitHub</w:t>
+              <w:t>ชื่อไฟล์ต้องเป็น .env ไม่ใช่ .env.txt และไม่ควรนำไฟล์ .env ขึ้น GitHub</w:t>
             </w:r>
           </w:p>
         </w:tc>
@@ -1009,7 +1009,7 @@
           <w:rFonts w:ascii="Arial" w:hAnsi="Arial" w:eastAsia="Arial"/>
           <w:sz w:val="22"/>
         </w:rPr>
-        <w:t>ส่วนนี้ใช้เมื่ออาจารย์ต้องการดาวน์โหลดโค้ดจาก GitHub และทดลองระบบด้วยฐานข้อมูลของตนเอง</w:t>
+        <w:t>ใช้ขั้นตอนนี้สำหรับติดตั้งและทดสอบระบบจาก repository บน GitHub</w:t>
       </w:r>
     </w:p>
     <w:p>
@@ -1045,7 +1045,7 @@
           <w:rFonts w:ascii="Arial" w:hAnsi="Arial" w:eastAsia="Arial"/>
           <w:sz w:val="22"/>
         </w:rPr>
-        <w:t>กรอกข้อมูลฐานข้อมูลใน backend/.env และกำหนด ADMIN_USERNAME กับ ADMIN_PASSWORD สำหรับใช้ล็อกอิน</w:t>
+        <w:t>กำหนดข้อมูลฐานข้อมูลใน backend/.env และระบุ ADMIN_USERNAME กับ ADMIN_PASSWORD สำหรับเข้าสู่ระบบ</w:t>
       </w:r>
     </w:p>
     <w:p>
@@ -1069,7 +1069,7 @@
           <w:rFonts w:ascii="Arial" w:hAnsi="Arial" w:eastAsia="Arial"/>
           <w:sz w:val="22"/>
         </w:rPr>
-        <w:t>ที่โฟลเดอร์หลักของโปรเจกต์ คัดลอก .env.example เป็น .env แล้วกำหนด EXPO_PUBLIC_API_BASE_URL ให้ตรงกับ Backend เช่น http://localhost:3056/api</w:t>
+        <w:t>ที่โฟลเดอร์หลักของโครงการ คัดลอก .env.example เป็น .env แล้วกำหนด EXPO_PUBLIC_API_BASE_URL ให้ตรงกับ Backend เช่น http://localhost:3056/api</w:t>
       </w:r>
     </w:p>
     <w:p>
@@ -1121,14 +1121,14 @@
                 <w:color w:val="1F4D78"/>
                 <w:sz w:val="22"/>
               </w:rPr>
-              <w:t xml:space="preserve">เรื่องความปลอดภัย: </w:t>
+              <w:t xml:space="preserve">ความปลอดภัย: </w:t>
             </w:r>
             <w:r>
               <w:rPr>
                 <w:rFonts w:ascii="Arial" w:hAnsi="Arial" w:eastAsia="Arial"/>
                 <w:sz w:val="22"/>
               </w:rPr>
-              <w:t>ไฟล์ .env ไม่มีใน GitHub เพราะเก็บข้อมูลฐานข้อมูลและรหัสผ่าน ส่วนไฟล์ .env.example เป็นเพียงแบบฟอร์มตัวอย่างสำหรับตั้งค่าบนเครื่องใหม่</w:t>
+              <w:t>ไฟล์ .env ไม่อยู่ใน GitHub เนื่องจากมีข้อมูลเชื่อมต่อฐานข้อมูลและรหัสผ่าน ส่วน .env.example ใช้เป็นแม่แบบสำหรับกำหนดค่าบนเครื่องใหม่</w:t>
             </w:r>
           </w:p>
         </w:tc>

</xml_diff>